<commit_message>
Add code listing to report
</commit_message>
<xml_diff>
--- a/report.docx
+++ b/report.docx
@@ -277,7 +277,7 @@
               </mc:Choice>
               <mc:Fallback>
                 <w:pict>
-                  <v:group w14:anchorId="13D213FE" id="Group 157" o:spid="_x0000_s1026" style="position:absolute;margin-left:0;margin-top:0;width:8in;height:95.7pt;z-index:251662336;mso-width-percent:941;mso-height-percent:121;mso-top-percent:23;mso-position-horizontal:center;mso-position-horizontal-relative:page;mso-position-vertical-relative:page;mso-width-percent:941;mso-height-percent:121;mso-top-percent:23" coordorigin="" coordsize="73152,12161" o:gfxdata="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">
+                  <v:group w14:anchorId="06F211C8" id="Group 157" o:spid="_x0000_s1026" style="position:absolute;margin-left:0;margin-top:0;width:8in;height:95.7pt;z-index:251662336;mso-width-percent:941;mso-height-percent:121;mso-top-percent:23;mso-position-horizontal:center;mso-position-horizontal-relative:page;mso-position-vertical-relative:page;mso-width-percent:941;mso-height-percent:121;mso-top-percent:23" coordorigin="" coordsize="73152,12161" o:gfxdata="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">
                     <v:shape id="Rectangle 51" o:spid="_x0000_s1027" style="position:absolute;width:73152;height:11303;visibility:visible;mso-wrap-style:square;v-text-anchor:middle" coordsize="7312660,1129665" o:gfxdata="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" path="m,l7312660,r,1129665l3619500,733425,,1091565,,xe" fillcolor="#4472c4 [3204]" stroked="f" strokeweight="1pt">
                       <v:stroke joinstyle="miter"/>
                       <v:path arrowok="t" o:connecttype="custom" o:connectlocs="0,0;7315200,0;7315200,1130373;3620757,733885;0,1092249;0,0" o:connectangles="0,0,0,0,0,0"/>
@@ -1222,13 +1222,258 @@
           <w:lang w:val="en-US"/>
         </w:rPr>
       </w:pPr>
-      <w:bookmarkStart w:id="0" w:name="_Toc226054158"/>
       <w:r>
         <w:rPr>
           <w:lang w:val="en-US"/>
         </w:rPr>
         <w:lastRenderedPageBreak/>
-        <w:t>Application Structure</w:t>
+        <w:t>Overview</w:t>
+      </w:r>
+    </w:p>
+    <w:p>
+      <w:pPr>
+        <w:rPr>
+          <w:lang w:val="en-US"/>
+        </w:rPr>
+      </w:pPr>
+    </w:p>
+    <w:p>
+      <w:pPr>
+        <w:pStyle w:val="Heading2"/>
+        <w:rPr>
+          <w:lang w:val="en-US"/>
+        </w:rPr>
+      </w:pPr>
+      <w:r>
+        <w:rPr>
+          <w:lang w:val="en-US"/>
+        </w:rPr>
+        <w:t>Code Listing</w:t>
+      </w:r>
+    </w:p>
+    <w:p>
+      <w:pPr>
+        <w:pStyle w:val="ListParagraph"/>
+        <w:numPr>
+          <w:ilvl w:val="0"/>
+          <w:numId w:val="2"/>
+        </w:numPr>
+        <w:rPr>
+          <w:lang w:val="en-US"/>
+        </w:rPr>
+      </w:pPr>
+      <w:r>
+        <w:rPr>
+          <w:lang w:val="en-US"/>
+        </w:rPr>
+        <w:t>CommonUtil: Contains a few static helper methods used both by the Coordinator and by Nodes</w:t>
+      </w:r>
+    </w:p>
+    <w:p>
+      <w:pPr>
+        <w:pStyle w:val="ListParagraph"/>
+        <w:numPr>
+          <w:ilvl w:val="0"/>
+          <w:numId w:val="2"/>
+        </w:numPr>
+        <w:rPr>
+          <w:lang w:val="en-US"/>
+        </w:rPr>
+      </w:pPr>
+      <w:r>
+        <w:rPr>
+          <w:lang w:val="en-US"/>
+        </w:rPr>
+        <w:t xml:space="preserve">Coordinator: Contains the entrypoint for </w:t>
+      </w:r>
+      <w:r>
+        <w:rPr>
+          <w:lang w:val="en-US"/>
+        </w:rPr>
+        <w:t>the Coordinator system</w:t>
+      </w:r>
+    </w:p>
+    <w:p>
+      <w:pPr>
+        <w:pStyle w:val="ListParagraph"/>
+        <w:numPr>
+          <w:ilvl w:val="0"/>
+          <w:numId w:val="2"/>
+        </w:numPr>
+        <w:rPr>
+          <w:lang w:val="en-US"/>
+        </w:rPr>
+      </w:pPr>
+      <w:r>
+        <w:rPr>
+          <w:lang w:val="en-US"/>
+        </w:rPr>
+        <w:t xml:space="preserve">CoordinatorBuffer: </w:t>
+      </w:r>
+      <w:r>
+        <w:rPr>
+          <w:lang w:val="en-US"/>
+        </w:rPr>
+        <w:t>Stores instances of CoordinatorRequest and provides access to stored requests in order of priority</w:t>
+      </w:r>
+    </w:p>
+    <w:p>
+      <w:pPr>
+        <w:pStyle w:val="ListParagraph"/>
+        <w:numPr>
+          <w:ilvl w:val="0"/>
+          <w:numId w:val="2"/>
+        </w:numPr>
+        <w:rPr>
+          <w:lang w:val="en-US"/>
+        </w:rPr>
+      </w:pPr>
+      <w:r>
+        <w:rPr>
+          <w:lang w:val="en-US"/>
+        </w:rPr>
+        <w:t xml:space="preserve">CoordinatorConnection: </w:t>
+      </w:r>
+      <w:r>
+        <w:rPr>
+          <w:lang w:val="en-US"/>
+        </w:rPr>
+        <w:t xml:space="preserve">Handles incoming requests from Nodes asking for critical section access </w:t>
+      </w:r>
+    </w:p>
+    <w:p>
+      <w:pPr>
+        <w:pStyle w:val="ListParagraph"/>
+        <w:numPr>
+          <w:ilvl w:val="0"/>
+          <w:numId w:val="2"/>
+        </w:numPr>
+        <w:rPr>
+          <w:lang w:val="en-US"/>
+        </w:rPr>
+      </w:pPr>
+      <w:r>
+        <w:rPr>
+          <w:lang w:val="en-US"/>
+        </w:rPr>
+        <w:t xml:space="preserve">CoordinatorMutex: </w:t>
+      </w:r>
+      <w:r>
+        <w:rPr>
+          <w:lang w:val="en-US"/>
+        </w:rPr>
+        <w:t>Handles stored requests, granting the token to each Node in the queue, one at a time</w:t>
+      </w:r>
+    </w:p>
+    <w:p>
+      <w:pPr>
+        <w:pStyle w:val="ListParagraph"/>
+        <w:numPr>
+          <w:ilvl w:val="0"/>
+          <w:numId w:val="2"/>
+        </w:numPr>
+        <w:rPr>
+          <w:lang w:val="en-US"/>
+        </w:rPr>
+      </w:pPr>
+      <w:r>
+        <w:rPr>
+          <w:lang w:val="en-US"/>
+        </w:rPr>
+        <w:t xml:space="preserve">CoordinatorReceiver: </w:t>
+      </w:r>
+      <w:r>
+        <w:rPr>
+          <w:lang w:val="en-US"/>
+        </w:rPr>
+        <w:t>Listens for incoming requests from Nodes and handles them accordingly, usually passing the Socket to a CoordinatorConnection thread</w:t>
+      </w:r>
+    </w:p>
+    <w:p>
+      <w:pPr>
+        <w:pStyle w:val="ListParagraph"/>
+        <w:numPr>
+          <w:ilvl w:val="0"/>
+          <w:numId w:val="2"/>
+        </w:numPr>
+        <w:rPr>
+          <w:lang w:val="en-US"/>
+        </w:rPr>
+      </w:pPr>
+      <w:r>
+        <w:rPr>
+          <w:lang w:val="en-US"/>
+        </w:rPr>
+        <w:t xml:space="preserve">CoordinatorRequest: </w:t>
+      </w:r>
+      <w:r>
+        <w:rPr>
+          <w:lang w:val="en-US"/>
+        </w:rPr>
+        <w:t>Record class used to store the host address, port, and priority of incoming requests from Nodes</w:t>
+      </w:r>
+    </w:p>
+    <w:p>
+      <w:pPr>
+        <w:pStyle w:val="ListParagraph"/>
+        <w:numPr>
+          <w:ilvl w:val="0"/>
+          <w:numId w:val="2"/>
+        </w:numPr>
+        <w:rPr>
+          <w:lang w:val="en-US"/>
+        </w:rPr>
+      </w:pPr>
+      <w:r>
+        <w:rPr>
+          <w:lang w:val="en-US"/>
+        </w:rPr>
+        <w:t xml:space="preserve">Node: </w:t>
+      </w:r>
+      <w:r>
+        <w:rPr>
+          <w:lang w:val="en-US"/>
+        </w:rPr>
+        <w:t>Requests critical section access from CoordinatorReceiver, and returns the token back to CoordinatorMutex after a small delay</w:t>
+      </w:r>
+    </w:p>
+    <w:p>
+      <w:pPr>
+        <w:pStyle w:val="ListParagraph"/>
+        <w:numPr>
+          <w:ilvl w:val="0"/>
+          <w:numId w:val="2"/>
+        </w:numPr>
+        <w:rPr>
+          <w:lang w:val="en-US"/>
+        </w:rPr>
+      </w:pPr>
+      <w:r>
+        <w:rPr>
+          <w:lang w:val="en-US"/>
+        </w:rPr>
+        <w:t>ShutdownInstigator:</w:t>
+      </w:r>
+      <w:r>
+        <w:rPr>
+          <w:lang w:val="en-US"/>
+        </w:rPr>
+        <w:t xml:space="preserve"> Sends a request to CoordinatorReceiver asking it to shut the whole system down.</w:t>
+      </w:r>
+    </w:p>
+    <w:p>
+      <w:pPr>
+        <w:pStyle w:val="Heading2"/>
+        <w:rPr>
+          <w:lang w:val="en-US"/>
+        </w:rPr>
+      </w:pPr>
+      <w:bookmarkStart w:id="0" w:name="_Toc226054160"/>
+      <w:r>
+        <w:rPr>
+          <w:lang w:val="en-US"/>
+        </w:rPr>
+        <w:t>Key Features</w:t>
       </w:r>
       <w:bookmarkEnd w:id="0"/>
     </w:p>
@@ -1246,12 +1491,12 @@
           <w:lang w:val="en-US"/>
         </w:rPr>
       </w:pPr>
-      <w:bookmarkStart w:id="1" w:name="_Toc226054159"/>
+      <w:bookmarkStart w:id="1" w:name="_Toc226054161"/>
       <w:r>
         <w:rPr>
           <w:lang w:val="en-US"/>
         </w:rPr>
-        <w:t>System Overview</w:t>
+        <w:t>Reflection</w:t>
       </w:r>
       <w:bookmarkEnd w:id="1"/>
     </w:p>
@@ -1269,12 +1514,12 @@
           <w:lang w:val="en-US"/>
         </w:rPr>
       </w:pPr>
-      <w:bookmarkStart w:id="2" w:name="_Toc226054160"/>
+      <w:bookmarkStart w:id="2" w:name="_Toc226054162"/>
       <w:r>
         <w:rPr>
           <w:lang w:val="en-US"/>
         </w:rPr>
-        <w:t>Key Features</w:t>
+        <w:t>Boundaries</w:t>
       </w:r>
       <w:bookmarkEnd w:id="2"/>
     </w:p>
@@ -1292,60 +1537,14 @@
           <w:lang w:val="en-US"/>
         </w:rPr>
       </w:pPr>
-      <w:bookmarkStart w:id="3" w:name="_Toc226054161"/>
+      <w:bookmarkStart w:id="3" w:name="_Toc226054163"/>
       <w:r>
         <w:rPr>
           <w:lang w:val="en-US"/>
         </w:rPr>
-        <w:t>Reflection</w:t>
+        <w:t>Test Cases</w:t>
       </w:r>
       <w:bookmarkEnd w:id="3"/>
-    </w:p>
-    <w:p>
-      <w:pPr>
-        <w:rPr>
-          <w:lang w:val="en-US"/>
-        </w:rPr>
-      </w:pPr>
-    </w:p>
-    <w:p>
-      <w:pPr>
-        <w:pStyle w:val="Heading2"/>
-        <w:rPr>
-          <w:lang w:val="en-US"/>
-        </w:rPr>
-      </w:pPr>
-      <w:bookmarkStart w:id="4" w:name="_Toc226054162"/>
-      <w:r>
-        <w:rPr>
-          <w:lang w:val="en-US"/>
-        </w:rPr>
-        <w:t>Boundaries</w:t>
-      </w:r>
-      <w:bookmarkEnd w:id="4"/>
-    </w:p>
-    <w:p>
-      <w:pPr>
-        <w:rPr>
-          <w:lang w:val="en-US"/>
-        </w:rPr>
-      </w:pPr>
-    </w:p>
-    <w:p>
-      <w:pPr>
-        <w:pStyle w:val="Heading2"/>
-        <w:rPr>
-          <w:lang w:val="en-US"/>
-        </w:rPr>
-      </w:pPr>
-      <w:bookmarkStart w:id="5" w:name="_Toc226054163"/>
-      <w:r>
-        <w:rPr>
-          <w:lang w:val="en-US"/>
-        </w:rPr>
-        <w:t>Test Cases</w:t>
-      </w:r>
-      <w:bookmarkEnd w:id="5"/>
     </w:p>
     <w:p>
       <w:pPr>
@@ -1491,9 +1690,9 @@
 <file path=word/numbering.xml><?xml version="1.0" encoding="utf-8"?>
 <w:numbering xmlns:wpc="http://schemas.microsoft.com/office/word/2010/wordprocessingCanvas" xmlns:cx="http://schemas.microsoft.com/office/drawing/2014/chartex" xmlns:cx1="http://schemas.microsoft.com/office/drawing/2015/9/8/chartex" xmlns:cx2="http://schemas.microsoft.com/office/drawing/2015/10/21/chartex" xmlns:cx3="http://schemas.microsoft.com/office/drawing/2016/5/9/chartex" xmlns:cx4="http://schemas.microsoft.com/office/drawing/2016/5/10/chartex" xmlns:cx5="http://schemas.microsoft.com/office/drawing/2016/5/11/chartex" xmlns:cx6="http://schemas.microsoft.com/office/drawing/2016/5/12/chartex" xmlns:cx7="http://schemas.microsoft.com/office/drawing/2016/5/13/chartex" xmlns:cx8="http://schemas.microsoft.com/office/drawing/2016/5/14/chartex" xmlns:mc="http://schemas.openxmlformats.org/markup-compatibility/2006" xmlns:aink="http://schemas.microsoft.com/office/drawing/2016/ink" xmlns:am3d="http://schemas.microsoft.com/office/drawing/2017/model3d" xmlns:o="urn:schemas-microsoft-com:office:office" xmlns:oel="http://schemas.microsoft.com/office/2019/extlst" xmlns:r="http://schemas.openxmlformats.org/officeDocument/2006/relationships" xmlns:m="http://schemas.openxmlformats.org/officeDocument/2006/math" xmlns:v="urn:schemas-microsoft-com:vml" xmlns:wp14="http://schemas.microsoft.com/office/word/2010/wordprocessingDrawing" xmlns:wp="http://schemas.openxmlformats.org/drawingml/2006/wordprocessingDrawing" xmlns:w10="urn:schemas-microsoft-com:office:word" xmlns:w="http://schemas.openxmlformats.org/wordprocessingml/2006/main" xmlns:w14="http://schemas.microsoft.com/office/word/2010/wordml" xmlns:w15="http://schemas.microsoft.com/office/word/2012/wordml" xmlns:w16cex="http://schemas.microsoft.com/office/word/2018/wordml/cex" xmlns:w16cid="http://schemas.microsoft.com/office/word/2016/wordml/cid" xmlns:w16="http://schemas.microsoft.com/office/word/2018/wordml" xmlns:w16du="http://schemas.microsoft.com/office/word/2023/wordml/word16du" xmlns:w16sdtdh="http://schemas.microsoft.com/office/word/2020/wordml/sdtdatahash" xmlns:w16sdtfl="http://schemas.microsoft.com/office/word/2024/wordml/sdtformatlock" xmlns:w16se="http://schemas.microsoft.com/office/word/2015/wordml/symex" xmlns:wpg="http://schemas.microsoft.com/office/word/2010/wordprocessingGroup" xmlns:wpi="http://schemas.microsoft.com/office/word/2010/wordprocessingInk" xmlns:wne="http://schemas.microsoft.com/office/word/2006/wordml" xmlns:wps="http://schemas.microsoft.com/office/word/2010/wordprocessingShape" mc:Ignorable="w14 w15 w16se w16cid w16 w16cex w16sdtdh w16sdtfl w16du wp14">
   <w:abstractNum w:abstractNumId="0" w15:restartNumberingAfterBreak="0">
-    <w:nsid w:val="73567C68"/>
+    <w:nsid w:val="57AE7A42"/>
     <w:multiLevelType w:val="hybridMultilevel"/>
-    <w:tmpl w:val="F1E0B1BC"/>
+    <w:tmpl w:val="EB84A418"/>
     <w:lvl w:ilvl="0" w:tplc="08090001">
       <w:start w:val="1"/>
       <w:numFmt w:val="bullet"/>
@@ -1603,7 +1802,123 @@
       </w:rPr>
     </w:lvl>
   </w:abstractNum>
+  <w:abstractNum w:abstractNumId="1" w15:restartNumberingAfterBreak="0">
+    <w:nsid w:val="73567C68"/>
+    <w:multiLevelType w:val="hybridMultilevel"/>
+    <w:tmpl w:val="F1E0B1BC"/>
+    <w:lvl w:ilvl="0" w:tplc="08090001">
+      <w:start w:val="1"/>
+      <w:numFmt w:val="bullet"/>
+      <w:lvlText w:val=""/>
+      <w:lvlJc w:val="left"/>
+      <w:pPr>
+        <w:ind w:left="720" w:hanging="360"/>
+      </w:pPr>
+      <w:rPr>
+        <w:rFonts w:ascii="Symbol" w:hAnsi="Symbol" w:hint="default"/>
+      </w:rPr>
+    </w:lvl>
+    <w:lvl w:ilvl="1" w:tplc="08090003" w:tentative="1">
+      <w:start w:val="1"/>
+      <w:numFmt w:val="bullet"/>
+      <w:lvlText w:val="o"/>
+      <w:lvlJc w:val="left"/>
+      <w:pPr>
+        <w:ind w:left="1440" w:hanging="360"/>
+      </w:pPr>
+      <w:rPr>
+        <w:rFonts w:ascii="Courier New" w:hAnsi="Courier New" w:cs="Courier New" w:hint="default"/>
+      </w:rPr>
+    </w:lvl>
+    <w:lvl w:ilvl="2" w:tplc="08090005" w:tentative="1">
+      <w:start w:val="1"/>
+      <w:numFmt w:val="bullet"/>
+      <w:lvlText w:val=""/>
+      <w:lvlJc w:val="left"/>
+      <w:pPr>
+        <w:ind w:left="2160" w:hanging="360"/>
+      </w:pPr>
+      <w:rPr>
+        <w:rFonts w:ascii="Wingdings" w:hAnsi="Wingdings" w:hint="default"/>
+      </w:rPr>
+    </w:lvl>
+    <w:lvl w:ilvl="3" w:tplc="08090001" w:tentative="1">
+      <w:start w:val="1"/>
+      <w:numFmt w:val="bullet"/>
+      <w:lvlText w:val=""/>
+      <w:lvlJc w:val="left"/>
+      <w:pPr>
+        <w:ind w:left="2880" w:hanging="360"/>
+      </w:pPr>
+      <w:rPr>
+        <w:rFonts w:ascii="Symbol" w:hAnsi="Symbol" w:hint="default"/>
+      </w:rPr>
+    </w:lvl>
+    <w:lvl w:ilvl="4" w:tplc="08090003" w:tentative="1">
+      <w:start w:val="1"/>
+      <w:numFmt w:val="bullet"/>
+      <w:lvlText w:val="o"/>
+      <w:lvlJc w:val="left"/>
+      <w:pPr>
+        <w:ind w:left="3600" w:hanging="360"/>
+      </w:pPr>
+      <w:rPr>
+        <w:rFonts w:ascii="Courier New" w:hAnsi="Courier New" w:cs="Courier New" w:hint="default"/>
+      </w:rPr>
+    </w:lvl>
+    <w:lvl w:ilvl="5" w:tplc="08090005" w:tentative="1">
+      <w:start w:val="1"/>
+      <w:numFmt w:val="bullet"/>
+      <w:lvlText w:val=""/>
+      <w:lvlJc w:val="left"/>
+      <w:pPr>
+        <w:ind w:left="4320" w:hanging="360"/>
+      </w:pPr>
+      <w:rPr>
+        <w:rFonts w:ascii="Wingdings" w:hAnsi="Wingdings" w:hint="default"/>
+      </w:rPr>
+    </w:lvl>
+    <w:lvl w:ilvl="6" w:tplc="08090001" w:tentative="1">
+      <w:start w:val="1"/>
+      <w:numFmt w:val="bullet"/>
+      <w:lvlText w:val=""/>
+      <w:lvlJc w:val="left"/>
+      <w:pPr>
+        <w:ind w:left="5040" w:hanging="360"/>
+      </w:pPr>
+      <w:rPr>
+        <w:rFonts w:ascii="Symbol" w:hAnsi="Symbol" w:hint="default"/>
+      </w:rPr>
+    </w:lvl>
+    <w:lvl w:ilvl="7" w:tplc="08090003" w:tentative="1">
+      <w:start w:val="1"/>
+      <w:numFmt w:val="bullet"/>
+      <w:lvlText w:val="o"/>
+      <w:lvlJc w:val="left"/>
+      <w:pPr>
+        <w:ind w:left="5760" w:hanging="360"/>
+      </w:pPr>
+      <w:rPr>
+        <w:rFonts w:ascii="Courier New" w:hAnsi="Courier New" w:cs="Courier New" w:hint="default"/>
+      </w:rPr>
+    </w:lvl>
+    <w:lvl w:ilvl="8" w:tplc="08090005" w:tentative="1">
+      <w:start w:val="1"/>
+      <w:numFmt w:val="bullet"/>
+      <w:lvlText w:val=""/>
+      <w:lvlJc w:val="left"/>
+      <w:pPr>
+        <w:ind w:left="6480" w:hanging="360"/>
+      </w:pPr>
+      <w:rPr>
+        <w:rFonts w:ascii="Wingdings" w:hAnsi="Wingdings" w:hint="default"/>
+      </w:rPr>
+    </w:lvl>
+  </w:abstractNum>
   <w:num w:numId="1" w16cid:durableId="2012176786">
+    <w:abstractNumId w:val="1"/>
+  </w:num>
+  <w:num w:numId="2" w16cid:durableId="663968098">
     <w:abstractNumId w:val="0"/>
   </w:num>
 </w:numbering>

</xml_diff>

<commit_message>
Also mention shared file logging
</commit_message>
<xml_diff>
--- a/report.docx
+++ b/report.docx
@@ -277,7 +277,7 @@
               </mc:Choice>
               <mc:Fallback>
                 <w:pict>
-                  <v:group w14:anchorId="4E4FA98B" id="Group 157" o:spid="_x0000_s1026" style="position:absolute;margin-left:0;margin-top:0;width:8in;height:95.7pt;z-index:251662336;mso-width-percent:941;mso-height-percent:121;mso-top-percent:23;mso-position-horizontal:center;mso-position-horizontal-relative:page;mso-position-vertical-relative:page;mso-width-percent:941;mso-height-percent:121;mso-top-percent:23" coordorigin="" coordsize="73152,12161" o:gfxdata="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">
+                  <v:group w14:anchorId="7EABB292" id="Group 157" o:spid="_x0000_s1026" style="position:absolute;margin-left:0;margin-top:0;width:8in;height:95.7pt;z-index:251662336;mso-width-percent:941;mso-height-percent:121;mso-top-percent:23;mso-position-horizontal:center;mso-position-horizontal-relative:page;mso-position-vertical-relative:page;mso-width-percent:941;mso-height-percent:121;mso-top-percent:23" coordorigin="" coordsize="73152,12161" o:gfxdata="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">
                     <v:shape id="Rectangle 51" o:spid="_x0000_s1027" style="position:absolute;width:73152;height:11303;visibility:visible;mso-wrap-style:square;v-text-anchor:middle" coordsize="7312660,1129665" o:gfxdata="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" path="m,l7312660,r,1129665l3619500,733425,,1091565,,xe" fillcolor="#4472c4 [3204]" stroked="f" strokeweight="1pt">
                       <v:stroke joinstyle="miter"/>
                       <v:path arrowok="t" o:connecttype="custom" o:connectlocs="0,0;7315200,0;7315200,1130373;3620757,733885;0,1092249;0,0" o:connectangles="0,0,0,0,0,0"/>
@@ -1538,11 +1538,61 @@
           <w:lang w:val="en-US"/>
         </w:rPr>
       </w:pPr>
-      <w:r>
-        <w:rPr>
-          <w:lang w:val="en-US"/>
-        </w:rPr>
-        <w:t xml:space="preserve">When started, the Coordinator will spin up two threads: CoordinatorMutex and CoordinatorReceiver, and both will be provided a reference to the same CoordinatorBuffer. </w:t>
+      <w:proofErr w:type="gramStart"/>
+      <w:r>
+        <w:rPr>
+          <w:lang w:val="en-US"/>
+        </w:rPr>
+        <w:t>When</w:t>
+      </w:r>
+      <w:proofErr w:type="gramEnd"/>
+      <w:r>
+        <w:rPr>
+          <w:lang w:val="en-US"/>
+        </w:rPr>
+        <w:t xml:space="preserve"> </w:t>
+      </w:r>
+      <w:proofErr w:type="gramStart"/>
+      <w:r>
+        <w:rPr>
+          <w:lang w:val="en-US"/>
+        </w:rPr>
+        <w:t>started</w:t>
+      </w:r>
+      <w:proofErr w:type="gramEnd"/>
+      <w:r>
+        <w:rPr>
+          <w:lang w:val="en-US"/>
+        </w:rPr>
+        <w:t xml:space="preserve">, the </w:t>
+      </w:r>
+      <w:proofErr w:type="gramStart"/>
+      <w:r>
+        <w:rPr>
+          <w:lang w:val="en-US"/>
+        </w:rPr>
+        <w:t>Coordinator</w:t>
+      </w:r>
+      <w:proofErr w:type="gramEnd"/>
+      <w:r>
+        <w:rPr>
+          <w:lang w:val="en-US"/>
+        </w:rPr>
+        <w:t xml:space="preserve"> will spin up two threads: CoordinatorMutex and CoordinatorReceiver, and both will be </w:t>
+      </w:r>
+      <w:proofErr w:type="gramStart"/>
+      <w:r>
+        <w:rPr>
+          <w:lang w:val="en-US"/>
+        </w:rPr>
+        <w:t>provided</w:t>
+      </w:r>
+      <w:proofErr w:type="gramEnd"/>
+      <w:r>
+        <w:rPr>
+          <w:lang w:val="en-US"/>
+        </w:rPr>
+        <w:t xml:space="preserve"> a reference to the same CoordinatorBuffer. </w:t>
       </w:r>
     </w:p>
     <w:p>
@@ -1555,7 +1605,21 @@
         <w:rPr>
           <w:lang w:val="en-US"/>
         </w:rPr>
-        <w:t xml:space="preserve">The CoordinatorReceiver will listen for incoming connections from Nodes and create a CoordinatorConnection thread for each connection it receives. That thread will handle the connection and act according to the first line of text sent - either storing the Node’s details in a CoordinatorRequest object and passing that to the CoordinatorBuffer (“REQUEST”), gracefully shutting the system down (“SHUTDOWN”), or doing nothing (“HEARTBEAT”). </w:t>
+        <w:t xml:space="preserve">The CoordinatorReceiver will listen </w:t>
+      </w:r>
+      <w:proofErr w:type="gramStart"/>
+      <w:r>
+        <w:rPr>
+          <w:lang w:val="en-US"/>
+        </w:rPr>
+        <w:t>for</w:t>
+      </w:r>
+      <w:proofErr w:type="gramEnd"/>
+      <w:r>
+        <w:rPr>
+          <w:lang w:val="en-US"/>
+        </w:rPr>
+        <w:t xml:space="preserve"> incoming connections from Nodes and create a CoordinatorConnection thread for each connection it receives. That thread will handle the connection and act according to the first line of text sent - either storing the Node’s details in a CoordinatorRequest object and passing that to the CoordinatorBuffer (“REQUEST”), gracefully shutting the system down (“SHUTDOWN”), or doing nothing (“HEARTBEAT”). </w:t>
       </w:r>
     </w:p>
     <w:p>
@@ -1568,7 +1632,49 @@
         <w:rPr>
           <w:lang w:val="en-US"/>
         </w:rPr>
-        <w:t>The CoordinatorMutex thread continuously tries to retrieve a CoordinatorRequest from the shared CoordinatorBuffer, blocking until one is available. CoordinatorRequest objects are released from the buffer in order of priority, then on a first-in-first-out (FIFO) basis. The buffer will preferentially release high priority requests, but will also release a smaller amount of lower priority requests to prevent starvation. When the CoordinatorMutex thread has obtained a CoordinatorRequest, it will connect to the specified host and port and grant the Node a token, and start listening for the token to be returned. That node will then begin executing in its critical section, and will return the token to the mutex thread when done.</w:t>
+        <w:t xml:space="preserve">The CoordinatorMutex thread continuously tries to retrieve a CoordinatorRequest from the shared CoordinatorBuffer, blocking until one is available. CoordinatorRequest objects are released from the buffer in order of priority, then on a first-in-first-out (FIFO) basis. The buffer will preferentially release high priority </w:t>
+      </w:r>
+      <w:proofErr w:type="gramStart"/>
+      <w:r>
+        <w:rPr>
+          <w:lang w:val="en-US"/>
+        </w:rPr>
+        <w:t>requests, but</w:t>
+      </w:r>
+      <w:proofErr w:type="gramEnd"/>
+      <w:r>
+        <w:rPr>
+          <w:lang w:val="en-US"/>
+        </w:rPr>
+        <w:t xml:space="preserve"> will also release a smaller amount of lower priority requests to prevent starvation. When the CoordinatorMutex thread has obtained a CoordinatorRequest, it will connect to the specified host and port and grant the Node a </w:t>
+      </w:r>
+      <w:proofErr w:type="gramStart"/>
+      <w:r>
+        <w:rPr>
+          <w:lang w:val="en-US"/>
+        </w:rPr>
+        <w:t>token, and</w:t>
+      </w:r>
+      <w:proofErr w:type="gramEnd"/>
+      <w:r>
+        <w:rPr>
+          <w:lang w:val="en-US"/>
+        </w:rPr>
+        <w:t xml:space="preserve"> start listening for the token to be returned. That node will then begin executing in its critical </w:t>
+      </w:r>
+      <w:proofErr w:type="gramStart"/>
+      <w:r>
+        <w:rPr>
+          <w:lang w:val="en-US"/>
+        </w:rPr>
+        <w:t>section, and</w:t>
+      </w:r>
+      <w:proofErr w:type="gramEnd"/>
+      <w:r>
+        <w:rPr>
+          <w:lang w:val="en-US"/>
+        </w:rPr>
+        <w:t xml:space="preserve"> will return the token to the mutex thread when done.</w:t>
       </w:r>
     </w:p>
     <w:p>
@@ -1581,7 +1687,21 @@
         <w:rPr>
           <w:lang w:val="en-US"/>
         </w:rPr>
-        <w:t>Nodes will cycle between requesting the token, waiting for the token to be granted, executing the critical section, and returning the token. This will continue until the Node’s process is killed or the Coordinator tells the Node to shut down.</w:t>
+        <w:t xml:space="preserve">Nodes will cycle between requesting the token, waiting for the token to be granted, executing the critical section, and returning the token. This will continue until the Node’s process is killed or the </w:t>
+      </w:r>
+      <w:proofErr w:type="gramStart"/>
+      <w:r>
+        <w:rPr>
+          <w:lang w:val="en-US"/>
+        </w:rPr>
+        <w:t>Coordinator</w:t>
+      </w:r>
+      <w:proofErr w:type="gramEnd"/>
+      <w:r>
+        <w:rPr>
+          <w:lang w:val="en-US"/>
+        </w:rPr>
+        <w:t xml:space="preserve"> tells the Node to shut down.</w:t>
       </w:r>
     </w:p>
     <w:p>
@@ -1594,7 +1714,35 @@
         <w:rPr>
           <w:lang w:val="en-US"/>
         </w:rPr>
-        <w:t xml:space="preserve">When started, the ShutdownInstigator will tell the Coordinator to shut down. The CoordinatorReceiver thread will stop listening for new connections and shut down. The CoordinatorMutex thread will tell all Nodes with requests still in the CoordinatorBuffer to shut down, and will then shut itself down. </w:t>
+        <w:t xml:space="preserve">When started, the ShutdownInstigator will tell the </w:t>
+      </w:r>
+      <w:proofErr w:type="gramStart"/>
+      <w:r>
+        <w:rPr>
+          <w:lang w:val="en-US"/>
+        </w:rPr>
+        <w:t>Coordinator</w:t>
+      </w:r>
+      <w:proofErr w:type="gramEnd"/>
+      <w:r>
+        <w:rPr>
+          <w:lang w:val="en-US"/>
+        </w:rPr>
+        <w:t xml:space="preserve"> to shut down. The CoordinatorReceiver thread will stop listening for new connections and shut down. The CoordinatorMutex thread will tell all Nodes with requests still in the CoordinatorBuffer to shut </w:t>
+      </w:r>
+      <w:proofErr w:type="gramStart"/>
+      <w:r>
+        <w:rPr>
+          <w:lang w:val="en-US"/>
+        </w:rPr>
+        <w:t>down, and</w:t>
+      </w:r>
+      <w:proofErr w:type="gramEnd"/>
+      <w:r>
+        <w:rPr>
+          <w:lang w:val="en-US"/>
+        </w:rPr>
+        <w:t xml:space="preserve"> will then shut itself down. </w:t>
       </w:r>
     </w:p>
     <w:p>
@@ -1628,7 +1776,21 @@
         <w:rPr>
           <w:lang w:val="en-US"/>
         </w:rPr>
-        <w:t>CommonUtil: Contains a few static helper methods used both by the Coordinator and by Nodes</w:t>
+        <w:t xml:space="preserve">CommonUtil: Contains a few static helper methods used both by the </w:t>
+      </w:r>
+      <w:proofErr w:type="gramStart"/>
+      <w:r>
+        <w:rPr>
+          <w:lang w:val="en-US"/>
+        </w:rPr>
+        <w:t>Coordinator</w:t>
+      </w:r>
+      <w:proofErr w:type="gramEnd"/>
+      <w:r>
+        <w:rPr>
+          <w:lang w:val="en-US"/>
+        </w:rPr>
+        <w:t xml:space="preserve"> and by Nodes</w:t>
       </w:r>
     </w:p>
     <w:p>
@@ -1646,13 +1808,41 @@
         <w:rPr>
           <w:lang w:val="en-US"/>
         </w:rPr>
-        <w:t xml:space="preserve">Coordinator: Contains the entrypoint for </w:t>
-      </w:r>
-      <w:r>
-        <w:rPr>
-          <w:lang w:val="en-US"/>
-        </w:rPr>
-        <w:t>the Coordinator system</w:t>
+        <w:t xml:space="preserve">Coordinator: Contains the </w:t>
+      </w:r>
+      <w:proofErr w:type="gramStart"/>
+      <w:r>
+        <w:rPr>
+          <w:lang w:val="en-US"/>
+        </w:rPr>
+        <w:t>entrypoint</w:t>
+      </w:r>
+      <w:proofErr w:type="gramEnd"/>
+      <w:r>
+        <w:rPr>
+          <w:lang w:val="en-US"/>
+        </w:rPr>
+        <w:t xml:space="preserve"> for </w:t>
+      </w:r>
+      <w:r>
+        <w:rPr>
+          <w:lang w:val="en-US"/>
+        </w:rPr>
+        <w:t xml:space="preserve">the </w:t>
+      </w:r>
+      <w:proofErr w:type="gramStart"/>
+      <w:r>
+        <w:rPr>
+          <w:lang w:val="en-US"/>
+        </w:rPr>
+        <w:t>Coordinator</w:t>
+      </w:r>
+      <w:proofErr w:type="gramEnd"/>
+      <w:r>
+        <w:rPr>
+          <w:lang w:val="en-US"/>
+        </w:rPr>
+        <w:t xml:space="preserve"> system</w:t>
       </w:r>
     </w:p>
     <w:p>
@@ -1748,7 +1938,21 @@
         <w:rPr>
           <w:lang w:val="en-US"/>
         </w:rPr>
-        <w:t>Listens for incoming requests from Nodes and handles them accordingly, usually passing the Socket to a CoordinatorConnection thread</w:t>
+        <w:t xml:space="preserve">Listens for incoming requests from Nodes and handles </w:t>
+      </w:r>
+      <w:proofErr w:type="gramStart"/>
+      <w:r>
+        <w:rPr>
+          <w:lang w:val="en-US"/>
+        </w:rPr>
+        <w:t>them</w:t>
+      </w:r>
+      <w:proofErr w:type="gramEnd"/>
+      <w:r>
+        <w:rPr>
+          <w:lang w:val="en-US"/>
+        </w:rPr>
+        <w:t xml:space="preserve"> accordingly, usually passing the Socket to a CoordinatorConnection thread</w:t>
       </w:r>
     </w:p>
     <w:p>
@@ -1866,7 +2070,19 @@
         <w:rPr>
           <w:lang w:val="en-US"/>
         </w:rPr>
-        <w:t>Nodes are granted access one at a time, in a mostly first-in-first-out basis, to execution of their critical section. This is accomplished through use of a centralized Coordinator system making use of a CoordinatorReceiver thread which listens for and stores a record of each incoming request, and a CoordinatorMutex thread, which grants the next node in the queue the token, and waits to receive it back before granting it to the next node in the queue.</w:t>
+        <w:t>Nodes are granted access one at a time, in a mostly first-in-first-out basis, to execution of their critical section. This is accomplished through use of a centralized Coordinator system making use of a CoordinatorReceiver thread which listens for and stores a record of each incoming request</w:t>
+      </w:r>
+      <w:r>
+        <w:rPr>
+          <w:lang w:val="en-US"/>
+        </w:rPr>
+        <w:t xml:space="preserve"> (requester host name, port, and priority)</w:t>
+      </w:r>
+      <w:r>
+        <w:rPr>
+          <w:lang w:val="en-US"/>
+        </w:rPr>
+        <w:t>, and a CoordinatorMutex thread, which grants the next node in the queue the token, and waits to receive it back before granting it to the next node in the queue.</w:t>
       </w:r>
     </w:p>
     <w:p>
@@ -1895,7 +2111,21 @@
         <w:rPr>
           <w:lang w:val="en-US"/>
         </w:rPr>
-        <w:t xml:space="preserve">Nodes must specify the desired priority level of their request when asking for token access, and requests will be handled by CoordinatorMutex accordingly. CoordinatorBuffer does not release CoordinatorRequest objects purely in order of priority or FIFO basis, but serves some lower priority requests first to prevent starvation. </w:t>
+        <w:t xml:space="preserve">Nodes must specify the desired priority level of their request when asking for token access, and requests will be handled by CoordinatorMutex accordingly. CoordinatorBuffer does not release CoordinatorRequest objects purely in order of priority or FIFO </w:t>
+      </w:r>
+      <w:proofErr w:type="gramStart"/>
+      <w:r>
+        <w:rPr>
+          <w:lang w:val="en-US"/>
+        </w:rPr>
+        <w:t>basis, but</w:t>
+      </w:r>
+      <w:proofErr w:type="gramEnd"/>
+      <w:r>
+        <w:rPr>
+          <w:lang w:val="en-US"/>
+        </w:rPr>
+        <w:t xml:space="preserve"> serves some lower priority requests first to prevent starvation. </w:t>
       </w:r>
     </w:p>
     <w:p>
@@ -1908,7 +2138,35 @@
         <w:rPr>
           <w:lang w:val="en-US"/>
         </w:rPr>
-        <w:t xml:space="preserve">In a repeating sequence, CoordinatorBuffer will attempt to release 8 CRITICAL requests, 4 HIGH requests, 2 MEDIUM requests, and 1 LOW request. This is spread evenly across the length of the sequence to ensure timely response to CRITICAL requests. This adapts accordingly based on the CoordinatorRequest$Priority Enum, scaling as powers of 2. CRITICAL requests are still answered preferentially, but other request priorities will not starve. In the event that the chosen queue is empty, the buffer will attempt to serve a request of the next lowest priority level, wrapping around from LOW to CRITICAL if there is at least one request (it must have </w:t>
+        <w:t xml:space="preserve">In a repeating sequence, CoordinatorBuffer will attempt to release 8 CRITICAL requests, 4 HIGH requests, 2 MEDIUM requests, and 1 LOW request. This is spread evenly across the length of the sequence to ensure timely response to CRITICAL requests. This adapts accordingly based on the </w:t>
+      </w:r>
+      <w:proofErr w:type="spellStart"/>
+      <w:r>
+        <w:rPr>
+          <w:lang w:val="en-US"/>
+        </w:rPr>
+        <w:t>CoordinatorRequest$Priority</w:t>
+      </w:r>
+      <w:proofErr w:type="spellEnd"/>
+      <w:r>
+        <w:rPr>
+          <w:lang w:val="en-US"/>
+        </w:rPr>
+        <w:t xml:space="preserve"> Enum, scaling as powers of 2. CRITICAL requests are still answered preferentially, but other request priorities will not starve. </w:t>
+      </w:r>
+      <w:proofErr w:type="gramStart"/>
+      <w:r>
+        <w:rPr>
+          <w:lang w:val="en-US"/>
+        </w:rPr>
+        <w:t>In the event that</w:t>
+      </w:r>
+      <w:proofErr w:type="gramEnd"/>
+      <w:r>
+        <w:rPr>
+          <w:lang w:val="en-US"/>
+        </w:rPr>
+        <w:t xml:space="preserve"> the chosen queue is empty, the buffer will attempt to serve a request of the next lowest priority level, wrapping around from LOW to CRITICAL if there is at least one request (it must have </w:t>
       </w:r>
       <w:r>
         <w:rPr>
@@ -1922,7 +2180,21 @@
         <w:rPr>
           <w:lang w:val="en-US"/>
         </w:rPr>
-        <w:t xml:space="preserve"> priority level, meaning the algorithm hasn’t yet seen that priority level, and will find it after wrapping around).</w:t>
+        <w:t xml:space="preserve"> priority level, meaning the algorithm </w:t>
+      </w:r>
+      <w:proofErr w:type="gramStart"/>
+      <w:r>
+        <w:rPr>
+          <w:lang w:val="en-US"/>
+        </w:rPr>
+        <w:t>hasn’t yet</w:t>
+      </w:r>
+      <w:proofErr w:type="gramEnd"/>
+      <w:r>
+        <w:rPr>
+          <w:lang w:val="en-US"/>
+        </w:rPr>
+        <w:t xml:space="preserve"> seen that priority level, and will find it after wrapping around).</w:t>
       </w:r>
     </w:p>
     <w:p>
@@ -1976,7 +2248,49 @@
         <w:rPr>
           <w:lang w:val="en-US"/>
         </w:rPr>
-        <w:t>Every 20 seconds, each Node waiting to be granted a token will send a short request to CoordinatorReceiver, sending only the line “HEARTBEAT”. Upon receiving this, the connection will immediately close, as no actual information is needed, only the proof of the successful connection. If the Coordinator crashes or is abruptly closed during operation, Nodes waiting for a response will be unable to make a successful “HEARTBEAT” request, and shut down, as the Coordinator must be unreachable or inactive. This will occur if the Coordinator loses network access, is shut down, or if the individual Node loses network access.</w:t>
+        <w:t xml:space="preserve">Every 20 seconds, each Node waiting to be granted a token will send a short request to CoordinatorReceiver, sending only the line “HEARTBEAT”. Upon receiving this, the connection will immediately close, as no actual information is needed, only </w:t>
+      </w:r>
+      <w:proofErr w:type="gramStart"/>
+      <w:r>
+        <w:rPr>
+          <w:lang w:val="en-US"/>
+        </w:rPr>
+        <w:t>the proof</w:t>
+      </w:r>
+      <w:proofErr w:type="gramEnd"/>
+      <w:r>
+        <w:rPr>
+          <w:lang w:val="en-US"/>
+        </w:rPr>
+        <w:t xml:space="preserve"> of the successful connection. If the Coordinator crashes or is abruptly closed during operation, Nodes waiting for a response will be unable to make a successful “HEARTBEAT” request, and shut down, as the </w:t>
+      </w:r>
+      <w:proofErr w:type="gramStart"/>
+      <w:r>
+        <w:rPr>
+          <w:lang w:val="en-US"/>
+        </w:rPr>
+        <w:t>Coordinator</w:t>
+      </w:r>
+      <w:proofErr w:type="gramEnd"/>
+      <w:r>
+        <w:rPr>
+          <w:lang w:val="en-US"/>
+        </w:rPr>
+        <w:t xml:space="preserve"> must be unreachable or inactive. This will occur if the </w:t>
+      </w:r>
+      <w:proofErr w:type="gramStart"/>
+      <w:r>
+        <w:rPr>
+          <w:lang w:val="en-US"/>
+        </w:rPr>
+        <w:t>Coordinator</w:t>
+      </w:r>
+      <w:proofErr w:type="gramEnd"/>
+      <w:r>
+        <w:rPr>
+          <w:lang w:val="en-US"/>
+        </w:rPr>
+        <w:t xml:space="preserve"> loses network access, is shut down, or if the individual Node loses network access.</w:t>
       </w:r>
     </w:p>
     <w:p>
@@ -2030,7 +2344,21 @@
         <w:rPr>
           <w:lang w:val="en-US"/>
         </w:rPr>
-        <w:t>close the SocketServer being used to accept new requests. CoordinatorReceiver, when instructed to stop serving new requests, will instruct CoordinatorMutex to immediately service all remaining requests (instructing those Nodes to shut down) and shut down too. Any Nodes that were not connected will attempt to request a token and fail to connect, calmly shutting down in the process.</w:t>
+        <w:t xml:space="preserve">close the </w:t>
+      </w:r>
+      <w:proofErr w:type="spellStart"/>
+      <w:r>
+        <w:rPr>
+          <w:lang w:val="en-US"/>
+        </w:rPr>
+        <w:t>SocketServer</w:t>
+      </w:r>
+      <w:proofErr w:type="spellEnd"/>
+      <w:r>
+        <w:rPr>
+          <w:lang w:val="en-US"/>
+        </w:rPr>
+        <w:t xml:space="preserve"> being used to accept new requests. CoordinatorReceiver, when instructed to stop serving new requests, will instruct CoordinatorMutex to immediately service all remaining requests (instructing those Nodes to shut down) and shut down too. Any Nodes that were not connected will attempt to request a token and fail to connect, calmly shutting down in the process.</w:t>
       </w:r>
     </w:p>
     <w:p>

</xml_diff>